<commit_message>
Permisos de uso publico a reportes orginados en la app
</commit_message>
<xml_diff>
--- a/SESTicket/SESTicket/Reports/docx/CEM-CO-SOP-09-SCF-06-FinishOperation.docx
+++ b/SESTicket/SESTicket/Reports/docx/CEM-CO-SOP-09-SCF-06-FinishOperation.docx
@@ -1859,4 +1859,10 @@
   <a:objectDefaults/>
   <a:extraClrSchemeLst/>
 </a:theme>
+</file>
+
+<file path=docMetadata/LabelInfo.xml><?xml version="1.0" encoding="utf-8"?>
+<clbl:labelList xmlns:clbl="http://schemas.microsoft.com/office/2020/mipLabelMetadata">
+  <clbl:label id="{25a1e02b-2518-4cba-a1bf-7c39639f6abf}" enabled="1" method="Privileged" siteId="{a3c00101-0c80-45a9-9ed3-af5cf05dda19}" contentBits="0" removed="0"/>
+</clbl:labelList>
 </file>
</xml_diff>